<commit_message>
feat: adicionar peso e edição de romaneio
  - adiciona peso da carga com unidade kg/ton no romaneio
  - inclui peso no card, formulário e PDF via modelo DOCX
  - permite editar romaneio para gerente e coordenador
  - ajusta edição de romaneios com itens antigos inativos
  - corrige formatação para preservar valores como 150 kg
  - adiciona migration e testes de segurança do romaneio
</commit_message>
<xml_diff>
--- a/Modelos/definitivos/Romaneio.docx
+++ b/Modelos/definitivos/Romaneio.docx
@@ -387,8 +387,7 @@
         </w:trPr>
         <w:tc>
           <w:tcPr>
-            <w:tcW w:w="10343" w:type="dxa"/>
-            <w:gridSpan w:val="5"/>
+            <w:tcW w:w="4957" w:type="dxa"/>
             <w:shd w:val="clear" w:color="auto" w:fill="E8E8E8"/>
             <w:vAlign w:val="center"/>
           </w:tcPr>
@@ -411,6 +410,66 @@
                 <w:szCs w:val="18"/>
               </w:rPr>
               <w:t>&lt;&lt;local&gt;&gt;</w:t>
+            </w:r>
+          </w:p>
+        </w:tc>
+        <w:tc>
+          <w:tcPr>
+            <w:tcW w:w="5386" w:type="dxa"/>
+            <w:gridSpan w:val="4"/>
+            <w:shd w:val="clear" w:color="auto" w:fill="E8E8E8"/>
+            <w:vAlign w:val="center"/>
+          </w:tcPr>
+          <w:p>
+            <w:r>
+              <w:rPr>
+                <w:b/>
+                <w:bCs/>
+                <w:sz w:val="18"/>
+                <w:szCs w:val="18"/>
+              </w:rPr>
+              <w:t>Peso da carga</w:t>
+            </w:r>
+            <w:r>
+              <w:rPr>
+                <w:b/>
+                <w:bCs/>
+                <w:sz w:val="18"/>
+                <w:szCs w:val="18"/>
+              </w:rPr>
+              <w:t xml:space="preserve">: </w:t>
+            </w:r>
+            <w:r>
+              <w:rPr>
+                <w:b/>
+                <w:bCs/>
+                <w:color w:val="11437E"/>
+                <w:sz w:val="18"/>
+                <w:szCs w:val="18"/>
+              </w:rPr>
+              <w:t>&lt;&lt;</w:t>
+            </w:r>
+            <w:proofErr w:type="spellStart"/>
+            <w:r>
+              <w:rPr>
+                <w:b/>
+                <w:bCs/>
+                <w:color w:val="11437E"/>
+                <w:sz w:val="18"/>
+                <w:szCs w:val="18"/>
+              </w:rPr>
+              <w:t>weight</w:t>
+            </w:r>
+            <w:proofErr w:type="spellEnd"/>
+            <w:r>
+              <w:rPr>
+                <w:b/>
+                <w:bCs/>
+                <w:color w:val="11437E"/>
+                <w:sz w:val="18"/>
+                <w:szCs w:val="18"/>
+              </w:rPr>
+              <w:t>&gt;&gt;</w:t>
             </w:r>
           </w:p>
         </w:tc>

</xml_diff>

<commit_message>
feat: implementar romaneio de entrada
</commit_message>
<xml_diff>
--- a/Modelos/definitivos/Romaneio.docx
+++ b/Modelos/definitivos/Romaneio.docx
@@ -37,7 +37,8 @@
         <w:gridCol w:w="4957"/>
         <w:gridCol w:w="7"/>
         <w:gridCol w:w="1694"/>
-        <w:gridCol w:w="1842"/>
+        <w:gridCol w:w="992"/>
+        <w:gridCol w:w="850"/>
         <w:gridCol w:w="1843"/>
       </w:tblGrid>
       <w:tr>
@@ -48,7 +49,7 @@
         <w:tc>
           <w:tcPr>
             <w:tcW w:w="10343" w:type="dxa"/>
-            <w:gridSpan w:val="5"/>
+            <w:gridSpan w:val="6"/>
             <w:shd w:val="clear" w:color="auto" w:fill="30503A"/>
             <w:vAlign w:val="center"/>
           </w:tcPr>
@@ -62,25 +63,7 @@
                 <w:bCs/>
                 <w:color w:val="E8E8E8"/>
               </w:rPr>
-              <w:t>&lt;&lt;</w:t>
-            </w:r>
-            <w:proofErr w:type="spellStart"/>
-            <w:r>
-              <w:rPr>
-                <w:b/>
-                <w:bCs/>
-                <w:color w:val="E8E8E8"/>
-              </w:rPr>
-              <w:t>mission</w:t>
-            </w:r>
-            <w:proofErr w:type="spellEnd"/>
-            <w:r>
-              <w:rPr>
-                <w:b/>
-                <w:bCs/>
-                <w:color w:val="E8E8E8"/>
-              </w:rPr>
-              <w:t>&gt;&gt;</w:t>
+              <w:t>&lt;&lt;mission&gt;&gt;</w:t>
             </w:r>
           </w:p>
         </w:tc>
@@ -115,36 +98,14 @@
                 <w:sz w:val="18"/>
                 <w:szCs w:val="18"/>
               </w:rPr>
-              <w:t>&lt;&lt;</w:t>
-            </w:r>
-            <w:proofErr w:type="spellStart"/>
-            <w:r>
-              <w:rPr>
-                <w:b/>
-                <w:bCs/>
-                <w:color w:val="11437E"/>
-                <w:sz w:val="18"/>
-                <w:szCs w:val="18"/>
-              </w:rPr>
-              <w:t>client</w:t>
-            </w:r>
-            <w:proofErr w:type="spellEnd"/>
-            <w:r>
-              <w:rPr>
-                <w:b/>
-                <w:bCs/>
-                <w:color w:val="11437E"/>
-                <w:sz w:val="18"/>
-                <w:szCs w:val="18"/>
-              </w:rPr>
-              <w:t>&gt;&gt;</w:t>
+              <w:t>&lt;&lt;client&gt;&gt;</w:t>
             </w:r>
           </w:p>
         </w:tc>
         <w:tc>
           <w:tcPr>
             <w:tcW w:w="3536" w:type="dxa"/>
-            <w:gridSpan w:val="2"/>
+            <w:gridSpan w:val="3"/>
             <w:shd w:val="clear" w:color="auto" w:fill="E8E8E8"/>
             <w:vAlign w:val="center"/>
           </w:tcPr>
@@ -166,29 +127,7 @@
                 <w:sz w:val="18"/>
                 <w:szCs w:val="18"/>
               </w:rPr>
-              <w:t>&lt;&lt;</w:t>
-            </w:r>
-            <w:proofErr w:type="spellStart"/>
-            <w:r>
-              <w:rPr>
-                <w:b/>
-                <w:bCs/>
-                <w:color w:val="11437E"/>
-                <w:sz w:val="18"/>
-                <w:szCs w:val="18"/>
-              </w:rPr>
-              <w:t>proposal</w:t>
-            </w:r>
-            <w:proofErr w:type="spellEnd"/>
-            <w:r>
-              <w:rPr>
-                <w:b/>
-                <w:bCs/>
-                <w:color w:val="11437E"/>
-                <w:sz w:val="18"/>
-                <w:szCs w:val="18"/>
-              </w:rPr>
-              <w:t>&gt;&gt;</w:t>
+              <w:t>&lt;&lt;proposal&gt;&gt;</w:t>
             </w:r>
           </w:p>
         </w:tc>
@@ -250,29 +189,7 @@
                 <w:sz w:val="18"/>
                 <w:szCs w:val="18"/>
               </w:rPr>
-              <w:t xml:space="preserve"> &lt;&lt;</w:t>
-            </w:r>
-            <w:proofErr w:type="spellStart"/>
-            <w:r>
-              <w:rPr>
-                <w:b/>
-                <w:bCs/>
-                <w:color w:val="11437E"/>
-                <w:sz w:val="18"/>
-                <w:szCs w:val="18"/>
-              </w:rPr>
-              <w:t>cnpj</w:t>
-            </w:r>
-            <w:proofErr w:type="spellEnd"/>
-            <w:r>
-              <w:rPr>
-                <w:b/>
-                <w:bCs/>
-                <w:color w:val="11437E"/>
-                <w:sz w:val="18"/>
-                <w:szCs w:val="18"/>
-              </w:rPr>
-              <w:t>&gt;&gt;</w:t>
+              <w:t xml:space="preserve"> &lt;&lt;cnpj&gt;&gt;</w:t>
             </w:r>
           </w:p>
         </w:tc>
@@ -319,36 +236,14 @@
                 <w:sz w:val="18"/>
                 <w:szCs w:val="18"/>
               </w:rPr>
-              <w:t>&lt;&lt;</w:t>
-            </w:r>
-            <w:proofErr w:type="spellStart"/>
-            <w:r>
-              <w:rPr>
-                <w:b/>
-                <w:bCs/>
-                <w:color w:val="11437E"/>
-                <w:sz w:val="18"/>
-                <w:szCs w:val="18"/>
-              </w:rPr>
-              <w:t>plate</w:t>
-            </w:r>
-            <w:proofErr w:type="spellEnd"/>
-            <w:r>
-              <w:rPr>
-                <w:b/>
-                <w:bCs/>
-                <w:color w:val="11437E"/>
-                <w:sz w:val="18"/>
-                <w:szCs w:val="18"/>
-              </w:rPr>
-              <w:t>&gt;&gt;</w:t>
+              <w:t>&lt;&lt;plate&gt;&gt;</w:t>
             </w:r>
           </w:p>
         </w:tc>
         <w:tc>
           <w:tcPr>
             <w:tcW w:w="3685" w:type="dxa"/>
-            <w:gridSpan w:val="2"/>
+            <w:gridSpan w:val="3"/>
             <w:shd w:val="clear" w:color="auto" w:fill="E8E8E8"/>
             <w:vAlign w:val="center"/>
           </w:tcPr>
@@ -415,8 +310,8 @@
         </w:tc>
         <w:tc>
           <w:tcPr>
-            <w:tcW w:w="5386" w:type="dxa"/>
-            <w:gridSpan w:val="4"/>
+            <w:tcW w:w="2693" w:type="dxa"/>
+            <w:gridSpan w:val="3"/>
             <w:shd w:val="clear" w:color="auto" w:fill="E8E8E8"/>
             <w:vAlign w:val="center"/>
           </w:tcPr>
@@ -447,9 +342,36 @@
                 <w:sz w:val="18"/>
                 <w:szCs w:val="18"/>
               </w:rPr>
-              <w:t>&lt;&lt;</w:t>
+              <w:t>&lt;&lt;weight&gt;&gt;</w:t>
             </w:r>
-            <w:proofErr w:type="spellStart"/>
+          </w:p>
+        </w:tc>
+        <w:tc>
+          <w:tcPr>
+            <w:tcW w:w="2693" w:type="dxa"/>
+            <w:gridSpan w:val="2"/>
+            <w:shd w:val="clear" w:color="auto" w:fill="E8E8E8"/>
+            <w:vAlign w:val="center"/>
+          </w:tcPr>
+          <w:p>
+            <w:r>
+              <w:rPr>
+                <w:b/>
+                <w:bCs/>
+                <w:sz w:val="18"/>
+                <w:szCs w:val="18"/>
+              </w:rPr>
+              <w:t>Tipo</w:t>
+            </w:r>
+            <w:r>
+              <w:rPr>
+                <w:b/>
+                <w:bCs/>
+                <w:sz w:val="18"/>
+                <w:szCs w:val="18"/>
+              </w:rPr>
+              <w:t xml:space="preserve">: </w:t>
+            </w:r>
             <w:r>
               <w:rPr>
                 <w:b/>
@@ -458,9 +380,18 @@
                 <w:sz w:val="18"/>
                 <w:szCs w:val="18"/>
               </w:rPr>
-              <w:t>weight</w:t>
+              <w:t>&lt;&lt;</w:t>
             </w:r>
-            <w:proofErr w:type="spellEnd"/>
+            <w:r>
+              <w:rPr>
+                <w:b/>
+                <w:bCs/>
+                <w:color w:val="11437E"/>
+                <w:sz w:val="18"/>
+                <w:szCs w:val="18"/>
+              </w:rPr>
+              <w:t>type</w:t>
+            </w:r>
             <w:r>
               <w:rPr>
                 <w:b/>
@@ -556,21 +487,7 @@
               <w:rPr>
                 <w:color w:val="000000" w:themeColor="text1"/>
               </w:rPr>
-              <w:t>&lt;&lt;</w:t>
-            </w:r>
-            <w:proofErr w:type="spellStart"/>
-            <w:r>
-              <w:rPr>
-                <w:color w:val="000000" w:themeColor="text1"/>
-              </w:rPr>
-              <w:t>quantity</w:t>
-            </w:r>
-            <w:proofErr w:type="spellEnd"/>
-            <w:r>
-              <w:rPr>
-                <w:color w:val="000000" w:themeColor="text1"/>
-              </w:rPr>
-              <w:t>&gt;&gt;</w:t>
+              <w:t>&lt;&lt;quantity&gt;&gt;</w:t>
             </w:r>
           </w:p>
         </w:tc>

</xml_diff>